<commit_message>
docs: se corrigió la evidencia de pruebas de los endpoints de ventas
</commit_message>
<xml_diff>
--- a/docs/REQUEST_EP27-EP40.docx
+++ b/docs/REQUEST_EP27-EP40.docx
@@ -73,8 +73,11 @@
     </w:p>
     <w:p>
       <w:r>
+        <w:rPr>
+          <w:noProof/>
+        </w:rPr>
         <w:drawing>
-          <wp:inline distT="0" distB="0" distL="0" distR="0" wp14:anchorId="0A159075" wp14:editId="092EB666">
+          <wp:inline distT="0" distB="0" distL="0" distR="0" wp14:anchorId="5D0342B7" wp14:editId="61234C15">
             <wp:extent cx="5400040" cy="2809875"/>
             <wp:effectExtent l="0" t="0" r="0" b="9525"/>
             <wp:docPr id="1" name="Imagen 1"/>
@@ -144,8 +147,11 @@
         </w:rPr>
       </w:pPr>
       <w:r>
+        <w:rPr>
+          <w:noProof/>
+        </w:rPr>
         <w:drawing>
-          <wp:anchor distT="0" distB="0" distL="114300" distR="114300" simplePos="0" relativeHeight="251658240" behindDoc="1" locked="0" layoutInCell="1" allowOverlap="1" wp14:anchorId="178AB15B">
+          <wp:anchor distT="0" distB="0" distL="114300" distR="114300" simplePos="0" relativeHeight="251658240" behindDoc="1" locked="0" layoutInCell="1" allowOverlap="1" wp14:anchorId="222AA729" wp14:editId="595B8817">
             <wp:simplePos x="0" y="0"/>
             <wp:positionH relativeFrom="column">
               <wp:posOffset>34290</wp:posOffset>
@@ -389,8 +395,11 @@
     </w:p>
     <w:p>
       <w:r>
+        <w:rPr>
+          <w:noProof/>
+        </w:rPr>
         <w:drawing>
-          <wp:inline distT="0" distB="0" distL="0" distR="0" wp14:anchorId="5807B2E2" wp14:editId="74C523AA">
+          <wp:inline distT="0" distB="0" distL="0" distR="0" wp14:anchorId="2780BD0A" wp14:editId="10E0E494">
             <wp:extent cx="5400040" cy="3328670"/>
             <wp:effectExtent l="0" t="0" r="0" b="5080"/>
             <wp:docPr id="4" name="Imagen 4"/>
@@ -481,10 +490,11 @@
       </w:pPr>
       <w:r>
         <w:rPr>
+          <w:noProof/>
           <w:lang w:val="en-US"/>
         </w:rPr>
         <w:drawing>
-          <wp:inline distT="0" distB="0" distL="0" distR="0" wp14:anchorId="3EAF82BF" wp14:editId="49E5F143">
+          <wp:inline distT="0" distB="0" distL="0" distR="0" wp14:anchorId="1EADC13B" wp14:editId="0ADAC882">
             <wp:extent cx="5400040" cy="2640965"/>
             <wp:effectExtent l="0" t="0" r="0" b="6985"/>
             <wp:docPr id="5" name="Imagen 5"/>
@@ -584,8 +594,11 @@
         <w:ind w:left="360"/>
       </w:pPr>
       <w:r>
+        <w:rPr>
+          <w:noProof/>
+        </w:rPr>
         <w:drawing>
-          <wp:inline distT="0" distB="0" distL="0" distR="0" wp14:anchorId="19D43A72" wp14:editId="38E33F0E">
+          <wp:inline distT="0" distB="0" distL="0" distR="0" wp14:anchorId="064ACF10" wp14:editId="7EF65640">
             <wp:extent cx="4924425" cy="2692683"/>
             <wp:effectExtent l="0" t="0" r="0" b="0"/>
             <wp:docPr id="6" name="Imagen 6"/>
@@ -668,8 +681,11 @@
         <w:ind w:left="360"/>
       </w:pPr>
       <w:r>
+        <w:rPr>
+          <w:noProof/>
+        </w:rPr>
         <w:drawing>
-          <wp:inline distT="0" distB="0" distL="0" distR="0" wp14:anchorId="14C5F394" wp14:editId="60E0A7E3">
+          <wp:inline distT="0" distB="0" distL="0" distR="0" wp14:anchorId="4B57D35B" wp14:editId="03541883">
             <wp:extent cx="5400040" cy="3178810"/>
             <wp:effectExtent l="0" t="0" r="0" b="2540"/>
             <wp:docPr id="7" name="Imagen 7"/>
@@ -1021,10 +1037,11 @@
       </w:pPr>
       <w:r>
         <w:rPr>
+          <w:noProof/>
           <w:lang w:val="en-US"/>
         </w:rPr>
         <w:drawing>
-          <wp:anchor distT="0" distB="0" distL="114300" distR="114300" simplePos="0" relativeHeight="251659264" behindDoc="1" locked="0" layoutInCell="1" allowOverlap="1" wp14:anchorId="75604D48">
+          <wp:anchor distT="0" distB="0" distL="114300" distR="114300" simplePos="0" relativeHeight="251659264" behindDoc="1" locked="0" layoutInCell="1" allowOverlap="1" wp14:anchorId="4C3D13E2" wp14:editId="5E30AB14">
             <wp:simplePos x="0" y="0"/>
             <wp:positionH relativeFrom="margin">
               <wp:align>right</wp:align>
@@ -1265,20 +1282,382 @@
     </w:p>
     <w:p>
       <w:pPr>
-        <w:ind w:left="360"/>
-        <w:rPr>
-          <w:lang w:val="en-US"/>
-        </w:rPr>
-      </w:pPr>
-      <w:r>
-        <w:rPr>
-          <w:lang w:val="en-US"/>
-        </w:rPr>
+        <w:shd w:val="clear" w:color="auto" w:fill="1E1E1E"/>
+        <w:spacing w:line="285" w:lineRule="atLeast"/>
+        <w:rPr>
+          <w:rFonts w:ascii="Consolas" w:eastAsia="Times New Roman" w:hAnsi="Consolas" w:cs="Times New Roman"/>
+          <w:color w:val="D4D4D4"/>
+          <w:sz w:val="21"/>
+          <w:szCs w:val="21"/>
+          <w:lang w:eastAsia="es-PE"/>
+        </w:rPr>
+      </w:pPr>
+      <w:r>
+        <w:t xml:space="preserve">JSON: </w:t>
+      </w:r>
+      <w:r>
+        <w:rPr>
+          <w:rFonts w:ascii="Consolas" w:eastAsia="Times New Roman" w:hAnsi="Consolas" w:cs="Times New Roman"/>
+          <w:color w:val="DCDCDC"/>
+          <w:sz w:val="21"/>
+          <w:szCs w:val="21"/>
+          <w:lang w:eastAsia="es-PE"/>
+        </w:rPr>
+        <w:t>{</w:t>
+      </w:r>
+    </w:p>
+    <w:p>
+      <w:pPr>
+        <w:shd w:val="clear" w:color="auto" w:fill="1E1E1E"/>
+        <w:spacing w:after="0" w:line="285" w:lineRule="atLeast"/>
+        <w:rPr>
+          <w:rFonts w:ascii="Consolas" w:eastAsia="Times New Roman" w:hAnsi="Consolas" w:cs="Times New Roman"/>
+          <w:color w:val="D4D4D4"/>
+          <w:sz w:val="21"/>
+          <w:szCs w:val="21"/>
+          <w:lang w:eastAsia="es-PE"/>
+        </w:rPr>
+      </w:pPr>
+      <w:r>
+        <w:rPr>
+          <w:rFonts w:ascii="Consolas" w:eastAsia="Times New Roman" w:hAnsi="Consolas" w:cs="Times New Roman"/>
+          <w:color w:val="D4D4D4"/>
+          <w:sz w:val="21"/>
+          <w:szCs w:val="21"/>
+          <w:lang w:eastAsia="es-PE"/>
+        </w:rPr>
+        <w:t>  </w:t>
+      </w:r>
+      <w:r>
+        <w:rPr>
+          <w:rFonts w:ascii="Consolas" w:eastAsia="Times New Roman" w:hAnsi="Consolas" w:cs="Times New Roman"/>
+          <w:color w:val="9CDCFE"/>
+          <w:sz w:val="21"/>
+          <w:szCs w:val="21"/>
+          <w:lang w:eastAsia="es-PE"/>
+        </w:rPr>
+        <w:t>"id"</w:t>
+      </w:r>
+      <w:r>
+        <w:rPr>
+          <w:rFonts w:ascii="Consolas" w:eastAsia="Times New Roman" w:hAnsi="Consolas" w:cs="Times New Roman"/>
+          <w:color w:val="DCDCDC"/>
+          <w:sz w:val="21"/>
+          <w:szCs w:val="21"/>
+          <w:lang w:eastAsia="es-PE"/>
+        </w:rPr>
+        <w:t>:</w:t>
+      </w:r>
+      <w:r>
+        <w:rPr>
+          <w:rFonts w:ascii="Consolas" w:eastAsia="Times New Roman" w:hAnsi="Consolas" w:cs="Times New Roman"/>
+          <w:color w:val="D4D4D4"/>
+          <w:sz w:val="21"/>
+          <w:szCs w:val="21"/>
+          <w:lang w:eastAsia="es-PE"/>
+        </w:rPr>
+        <w:t> </w:t>
+      </w:r>
+      <w:r>
+        <w:rPr>
+          <w:rFonts w:ascii="Consolas" w:eastAsia="Times New Roman" w:hAnsi="Consolas" w:cs="Times New Roman"/>
+          <w:color w:val="B5CEA8"/>
+          <w:sz w:val="21"/>
+          <w:szCs w:val="21"/>
+          <w:lang w:eastAsia="es-PE"/>
+        </w:rPr>
+        <w:t>5</w:t>
+      </w:r>
+      <w:r>
+        <w:rPr>
+          <w:rFonts w:ascii="Consolas" w:eastAsia="Times New Roman" w:hAnsi="Consolas" w:cs="Times New Roman"/>
+          <w:color w:val="DCDCDC"/>
+          <w:sz w:val="21"/>
+          <w:szCs w:val="21"/>
+          <w:lang w:eastAsia="es-PE"/>
+        </w:rPr>
+        <w:t>,</w:t>
+      </w:r>
+    </w:p>
+    <w:p>
+      <w:pPr>
+        <w:shd w:val="clear" w:color="auto" w:fill="1E1E1E"/>
+        <w:spacing w:after="0" w:line="285" w:lineRule="atLeast"/>
+        <w:rPr>
+          <w:rFonts w:ascii="Consolas" w:eastAsia="Times New Roman" w:hAnsi="Consolas" w:cs="Times New Roman"/>
+          <w:color w:val="D4D4D4"/>
+          <w:sz w:val="21"/>
+          <w:szCs w:val="21"/>
+          <w:lang w:eastAsia="es-PE"/>
+        </w:rPr>
+      </w:pPr>
+      <w:r>
+        <w:rPr>
+          <w:rFonts w:ascii="Consolas" w:eastAsia="Times New Roman" w:hAnsi="Consolas" w:cs="Times New Roman"/>
+          <w:color w:val="D4D4D4"/>
+          <w:sz w:val="21"/>
+          <w:szCs w:val="21"/>
+          <w:lang w:eastAsia="es-PE"/>
+        </w:rPr>
+        <w:t>  </w:t>
+      </w:r>
+      <w:r>
+        <w:rPr>
+          <w:rFonts w:ascii="Consolas" w:eastAsia="Times New Roman" w:hAnsi="Consolas" w:cs="Times New Roman"/>
+          <w:color w:val="9CDCFE"/>
+          <w:sz w:val="21"/>
+          <w:szCs w:val="21"/>
+          <w:lang w:eastAsia="es-PE"/>
+        </w:rPr>
+        <w:t>"nombre"</w:t>
+      </w:r>
+      <w:r>
+        <w:rPr>
+          <w:rFonts w:ascii="Consolas" w:eastAsia="Times New Roman" w:hAnsi="Consolas" w:cs="Times New Roman"/>
+          <w:color w:val="DCDCDC"/>
+          <w:sz w:val="21"/>
+          <w:szCs w:val="21"/>
+          <w:lang w:eastAsia="es-PE"/>
+        </w:rPr>
+        <w:t>:</w:t>
+      </w:r>
+      <w:r>
+        <w:rPr>
+          <w:rFonts w:ascii="Consolas" w:eastAsia="Times New Roman" w:hAnsi="Consolas" w:cs="Times New Roman"/>
+          <w:color w:val="D4D4D4"/>
+          <w:sz w:val="21"/>
+          <w:szCs w:val="21"/>
+          <w:lang w:eastAsia="es-PE"/>
+        </w:rPr>
+        <w:t> </w:t>
+      </w:r>
+      <w:r>
+        <w:rPr>
+          <w:rFonts w:ascii="Consolas" w:eastAsia="Times New Roman" w:hAnsi="Consolas" w:cs="Times New Roman"/>
+          <w:color w:val="CE9178"/>
+          <w:sz w:val="21"/>
+          <w:szCs w:val="21"/>
+          <w:lang w:eastAsia="es-PE"/>
+        </w:rPr>
+        <w:t>"Plin"</w:t>
+      </w:r>
+      <w:r>
+        <w:rPr>
+          <w:rFonts w:ascii="Consolas" w:eastAsia="Times New Roman" w:hAnsi="Consolas" w:cs="Times New Roman"/>
+          <w:color w:val="DCDCDC"/>
+          <w:sz w:val="21"/>
+          <w:szCs w:val="21"/>
+          <w:lang w:eastAsia="es-PE"/>
+        </w:rPr>
+        <w:t>,</w:t>
+      </w:r>
+    </w:p>
+    <w:p>
+      <w:pPr>
+        <w:shd w:val="clear" w:color="auto" w:fill="1E1E1E"/>
+        <w:spacing w:after="0" w:line="285" w:lineRule="atLeast"/>
+        <w:rPr>
+          <w:rFonts w:ascii="Consolas" w:eastAsia="Times New Roman" w:hAnsi="Consolas" w:cs="Times New Roman"/>
+          <w:color w:val="D4D4D4"/>
+          <w:sz w:val="21"/>
+          <w:szCs w:val="21"/>
+          <w:lang w:eastAsia="es-PE"/>
+        </w:rPr>
+      </w:pPr>
+      <w:r>
+        <w:rPr>
+          <w:rFonts w:ascii="Consolas" w:eastAsia="Times New Roman" w:hAnsi="Consolas" w:cs="Times New Roman"/>
+          <w:color w:val="D4D4D4"/>
+          <w:sz w:val="21"/>
+          <w:szCs w:val="21"/>
+          <w:lang w:eastAsia="es-PE"/>
+        </w:rPr>
+        <w:t>  </w:t>
+      </w:r>
+      <w:r>
+        <w:rPr>
+          <w:rFonts w:ascii="Consolas" w:eastAsia="Times New Roman" w:hAnsi="Consolas" w:cs="Times New Roman"/>
+          <w:color w:val="9CDCFE"/>
+          <w:sz w:val="21"/>
+          <w:szCs w:val="21"/>
+          <w:lang w:eastAsia="es-PE"/>
+        </w:rPr>
+        <w:t>"</w:t>
+      </w:r>
+      <w:proofErr w:type="spellStart"/>
+      <w:r>
+        <w:rPr>
+          <w:rFonts w:ascii="Consolas" w:eastAsia="Times New Roman" w:hAnsi="Consolas" w:cs="Times New Roman"/>
+          <w:color w:val="9CDCFE"/>
+          <w:sz w:val="21"/>
+          <w:szCs w:val="21"/>
+          <w:lang w:eastAsia="es-PE"/>
+        </w:rPr>
+        <w:t>descripcion</w:t>
+      </w:r>
+      <w:proofErr w:type="spellEnd"/>
+      <w:r>
+        <w:rPr>
+          <w:rFonts w:ascii="Consolas" w:eastAsia="Times New Roman" w:hAnsi="Consolas" w:cs="Times New Roman"/>
+          <w:color w:val="9CDCFE"/>
+          <w:sz w:val="21"/>
+          <w:szCs w:val="21"/>
+          <w:lang w:eastAsia="es-PE"/>
+        </w:rPr>
+        <w:t>"</w:t>
+      </w:r>
+      <w:r>
+        <w:rPr>
+          <w:rFonts w:ascii="Consolas" w:eastAsia="Times New Roman" w:hAnsi="Consolas" w:cs="Times New Roman"/>
+          <w:color w:val="DCDCDC"/>
+          <w:sz w:val="21"/>
+          <w:szCs w:val="21"/>
+          <w:lang w:eastAsia="es-PE"/>
+        </w:rPr>
+        <w:t>:</w:t>
+      </w:r>
+      <w:r>
+        <w:rPr>
+          <w:rFonts w:ascii="Consolas" w:eastAsia="Times New Roman" w:hAnsi="Consolas" w:cs="Times New Roman"/>
+          <w:color w:val="D4D4D4"/>
+          <w:sz w:val="21"/>
+          <w:szCs w:val="21"/>
+          <w:lang w:eastAsia="es-PE"/>
+        </w:rPr>
+        <w:t> </w:t>
+      </w:r>
+      <w:r>
+        <w:rPr>
+          <w:rFonts w:ascii="Consolas" w:eastAsia="Times New Roman" w:hAnsi="Consolas" w:cs="Times New Roman"/>
+          <w:color w:val="CE9178"/>
+          <w:sz w:val="21"/>
+          <w:szCs w:val="21"/>
+          <w:lang w:eastAsia="es-PE"/>
+        </w:rPr>
+        <w:t>"Pago con billetera Plin"</w:t>
+      </w:r>
+      <w:r>
+        <w:rPr>
+          <w:rFonts w:ascii="Consolas" w:eastAsia="Times New Roman" w:hAnsi="Consolas" w:cs="Times New Roman"/>
+          <w:color w:val="DCDCDC"/>
+          <w:sz w:val="21"/>
+          <w:szCs w:val="21"/>
+          <w:lang w:eastAsia="es-PE"/>
+        </w:rPr>
+        <w:t>,</w:t>
+      </w:r>
+    </w:p>
+    <w:p>
+      <w:pPr>
+        <w:shd w:val="clear" w:color="auto" w:fill="1E1E1E"/>
+        <w:spacing w:after="0" w:line="285" w:lineRule="atLeast"/>
+        <w:rPr>
+          <w:rFonts w:ascii="Consolas" w:eastAsia="Times New Roman" w:hAnsi="Consolas" w:cs="Times New Roman"/>
+          <w:color w:val="D4D4D4"/>
+          <w:sz w:val="21"/>
+          <w:szCs w:val="21"/>
+          <w:lang w:eastAsia="es-PE"/>
+        </w:rPr>
+      </w:pPr>
+      <w:r>
+        <w:rPr>
+          <w:rFonts w:ascii="Consolas" w:eastAsia="Times New Roman" w:hAnsi="Consolas" w:cs="Times New Roman"/>
+          <w:color w:val="D4D4D4"/>
+          <w:sz w:val="21"/>
+          <w:szCs w:val="21"/>
+          <w:lang w:eastAsia="es-PE"/>
+        </w:rPr>
+        <w:t>  </w:t>
+      </w:r>
+      <w:r>
+        <w:rPr>
+          <w:rFonts w:ascii="Consolas" w:eastAsia="Times New Roman" w:hAnsi="Consolas" w:cs="Times New Roman"/>
+          <w:color w:val="9CDCFE"/>
+          <w:sz w:val="21"/>
+          <w:szCs w:val="21"/>
+          <w:lang w:eastAsia="es-PE"/>
+        </w:rPr>
+        <w:t>"activo"</w:t>
+      </w:r>
+      <w:r>
+        <w:rPr>
+          <w:rFonts w:ascii="Consolas" w:eastAsia="Times New Roman" w:hAnsi="Consolas" w:cs="Times New Roman"/>
+          <w:color w:val="DCDCDC"/>
+          <w:sz w:val="21"/>
+          <w:szCs w:val="21"/>
+          <w:lang w:eastAsia="es-PE"/>
+        </w:rPr>
+        <w:t>:</w:t>
+      </w:r>
+      <w:r>
+        <w:rPr>
+          <w:rFonts w:ascii="Consolas" w:eastAsia="Times New Roman" w:hAnsi="Consolas" w:cs="Times New Roman"/>
+          <w:color w:val="D4D4D4"/>
+          <w:sz w:val="21"/>
+          <w:szCs w:val="21"/>
+          <w:lang w:eastAsia="es-PE"/>
+        </w:rPr>
+        <w:t> </w:t>
+      </w:r>
+      <w:r>
+        <w:rPr>
+          <w:rFonts w:ascii="Consolas" w:eastAsia="Times New Roman" w:hAnsi="Consolas" w:cs="Times New Roman"/>
+          <w:color w:val="CE9178"/>
+          <w:sz w:val="21"/>
+          <w:szCs w:val="21"/>
+          <w:lang w:eastAsia="es-PE"/>
+        </w:rPr>
+        <w:t>true</w:t>
+      </w:r>
+    </w:p>
+    <w:p>
+      <w:pPr>
+        <w:shd w:val="clear" w:color="auto" w:fill="1E1E1E"/>
+        <w:spacing w:after="0" w:line="285" w:lineRule="atLeast"/>
+        <w:rPr>
+          <w:rFonts w:ascii="Consolas" w:eastAsia="Times New Roman" w:hAnsi="Consolas" w:cs="Times New Roman"/>
+          <w:color w:val="D4D4D4"/>
+          <w:sz w:val="21"/>
+          <w:szCs w:val="21"/>
+          <w:lang w:eastAsia="es-PE"/>
+        </w:rPr>
+      </w:pPr>
+      <w:r>
+        <w:rPr>
+          <w:rFonts w:ascii="Consolas" w:eastAsia="Times New Roman" w:hAnsi="Consolas" w:cs="Times New Roman"/>
+          <w:color w:val="DCDCDC"/>
+          <w:sz w:val="21"/>
+          <w:szCs w:val="21"/>
+          <w:lang w:eastAsia="es-PE"/>
+        </w:rPr>
+        <w:t>}</w:t>
+      </w:r>
+    </w:p>
+    <w:p>
+      <w:pPr>
+        <w:ind w:left="360"/>
+        <w:rPr>
+          <w:lang w:val="en-US"/>
+        </w:rPr>
+      </w:pPr>
+    </w:p>
+    <w:p>
+      <w:pPr>
+        <w:ind w:left="360"/>
+        <w:rPr>
+          <w:lang w:val="en-US"/>
+        </w:rPr>
+      </w:pPr>
+      <w:r>
+        <w:rPr>
+          <w:lang w:val="en-US"/>
+        </w:rPr>
+        <w:lastRenderedPageBreak/>
         <w:drawing>
-          <wp:inline distT="0" distB="0" distL="0" distR="0" wp14:anchorId="57494652" wp14:editId="7AECB7EA">
-            <wp:extent cx="5400040" cy="2976880"/>
-            <wp:effectExtent l="0" t="0" r="0" b="0"/>
-            <wp:docPr id="9" name="Imagen 9"/>
+          <wp:inline distT="0" distB="0" distL="0" distR="0" wp14:anchorId="5B2815B3" wp14:editId="6A1B508C">
+            <wp:extent cx="5400040" cy="2829560"/>
+            <wp:effectExtent l="0" t="0" r="0" b="8890"/>
+            <wp:docPr id="20" name="Imagen 20"/>
             <wp:cNvGraphicFramePr>
               <a:graphicFrameLocks xmlns:a="http://schemas.openxmlformats.org/drawingml/2006/main" noChangeAspect="1"/>
             </wp:cNvGraphicFramePr>
@@ -1298,7 +1677,7 @@
                   <pic:spPr>
                     <a:xfrm>
                       <a:off x="0" y="0"/>
-                      <a:ext cx="5400040" cy="2976880"/>
+                      <a:ext cx="5400040" cy="2829560"/>
                     </a:xfrm>
                     <a:prstGeom prst="rect">
                       <a:avLst/>
@@ -1313,6 +1692,14 @@
     </w:p>
     <w:p>
       <w:pPr>
+        <w:ind w:left="360"/>
+        <w:rPr>
+          <w:lang w:val="en-US"/>
+        </w:rPr>
+      </w:pPr>
+    </w:p>
+    <w:p>
+      <w:pPr>
         <w:pStyle w:val="Prrafodelista"/>
         <w:numPr>
           <w:ilvl w:val="0"/>
@@ -1326,7 +1713,6 @@
         <w:rPr>
           <w:b/>
         </w:rPr>
-        <w:lastRenderedPageBreak/>
         <w:t xml:space="preserve">EP34 – Listar </w:t>
       </w:r>
       <w:proofErr w:type="spellStart"/>
@@ -1382,10 +1768,11 @@
       </w:pPr>
       <w:r>
         <w:rPr>
+          <w:noProof/>
           <w:lang w:val="en-US"/>
         </w:rPr>
         <w:drawing>
-          <wp:inline distT="0" distB="0" distL="0" distR="0" wp14:anchorId="6B29A263" wp14:editId="624C9735">
+          <wp:inline distT="0" distB="0" distL="0" distR="0" wp14:anchorId="4AAB5B97" wp14:editId="2AE5807B">
             <wp:extent cx="5400040" cy="3129915"/>
             <wp:effectExtent l="0" t="0" r="0" b="0"/>
             <wp:docPr id="10" name="Imagen 10"/>
@@ -1431,6 +1818,46 @@
     </w:p>
     <w:p>
       <w:pPr>
+        <w:ind w:left="360"/>
+        <w:rPr>
+          <w:lang w:val="en-US"/>
+        </w:rPr>
+      </w:pPr>
+    </w:p>
+    <w:p>
+      <w:pPr>
+        <w:ind w:left="360"/>
+        <w:rPr>
+          <w:lang w:val="en-US"/>
+        </w:rPr>
+      </w:pPr>
+    </w:p>
+    <w:p>
+      <w:pPr>
+        <w:ind w:left="360"/>
+        <w:rPr>
+          <w:lang w:val="en-US"/>
+        </w:rPr>
+      </w:pPr>
+    </w:p>
+    <w:p>
+      <w:pPr>
+        <w:ind w:left="360"/>
+        <w:rPr>
+          <w:lang w:val="en-US"/>
+        </w:rPr>
+      </w:pPr>
+    </w:p>
+    <w:p>
+      <w:pPr>
+        <w:ind w:left="360"/>
+        <w:rPr>
+          <w:lang w:val="en-US"/>
+        </w:rPr>
+      </w:pPr>
+    </w:p>
+    <w:p>
+      <w:pPr>
         <w:pStyle w:val="Prrafodelista"/>
         <w:numPr>
           <w:ilvl w:val="0"/>
@@ -1444,6 +1871,7 @@
         <w:rPr>
           <w:b/>
         </w:rPr>
+        <w:lastRenderedPageBreak/>
         <w:t xml:space="preserve">EP35 – Buscar </w:t>
       </w:r>
       <w:proofErr w:type="spellStart"/>
@@ -1505,10 +1933,11 @@
       </w:pPr>
       <w:r>
         <w:rPr>
+          <w:noProof/>
           <w:lang w:val="en-US"/>
         </w:rPr>
         <w:drawing>
-          <wp:inline distT="0" distB="0" distL="0" distR="0" wp14:anchorId="1D1B4D41" wp14:editId="7152322B">
+          <wp:inline distT="0" distB="0" distL="0" distR="0" wp14:anchorId="417EB33E" wp14:editId="34AF3315">
             <wp:extent cx="5400040" cy="2880360"/>
             <wp:effectExtent l="0" t="0" r="0" b="0"/>
             <wp:docPr id="11" name="Imagen 11"/>
@@ -1591,7 +2020,6 @@
         <w:rPr>
           <w:b/>
         </w:rPr>
-        <w:lastRenderedPageBreak/>
         <w:t xml:space="preserve">EP36 – Dar de baja método de pago </w:t>
       </w:r>
     </w:p>
@@ -1619,8 +2047,11 @@
         <w:ind w:left="360"/>
       </w:pPr>
       <w:r>
+        <w:rPr>
+          <w:noProof/>
+        </w:rPr>
         <w:drawing>
-          <wp:inline distT="0" distB="0" distL="0" distR="0" wp14:anchorId="1BECEAF6" wp14:editId="366874E1">
+          <wp:inline distT="0" distB="0" distL="0" distR="0" wp14:anchorId="40477323" wp14:editId="1018DCA3">
             <wp:extent cx="5400040" cy="2780030"/>
             <wp:effectExtent l="0" t="0" r="0" b="1270"/>
             <wp:docPr id="12" name="Imagen 12"/>
@@ -1677,6 +2108,7 @@
         <w:rPr>
           <w:b/>
         </w:rPr>
+        <w:lastRenderedPageBreak/>
         <w:t>EP37A – Registrar venta</w:t>
       </w:r>
     </w:p>
@@ -2637,10 +3069,11 @@
       </w:pPr>
       <w:r>
         <w:rPr>
+          <w:noProof/>
           <w:lang w:val="en-US"/>
         </w:rPr>
         <w:drawing>
-          <wp:anchor distT="0" distB="0" distL="114300" distR="114300" simplePos="0" relativeHeight="251660288" behindDoc="1" locked="0" layoutInCell="1" allowOverlap="1" wp14:anchorId="41F92635">
+          <wp:anchor distT="0" distB="0" distL="114300" distR="114300" simplePos="0" relativeHeight="251660288" behindDoc="1" locked="0" layoutInCell="1" allowOverlap="1" wp14:anchorId="24D5014E" wp14:editId="1A9FC7A2">
             <wp:simplePos x="0" y="0"/>
             <wp:positionH relativeFrom="column">
               <wp:posOffset>-41910</wp:posOffset>
@@ -2769,7 +3202,6 @@
           <w:b/>
           <w:lang w:val="en-US"/>
         </w:rPr>
-        <w:lastRenderedPageBreak/>
         <w:t xml:space="preserve">EP37B – Registrar </w:t>
       </w:r>
       <w:proofErr w:type="spellStart"/>
@@ -3748,16 +4180,14 @@
     <w:p>
       <w:pPr>
         <w:ind w:left="360"/>
-        <w:rPr>
-          <w:lang w:val="en-US"/>
-        </w:rPr>
-      </w:pPr>
-      <w:r>
-        <w:rPr>
+      </w:pPr>
+      <w:r>
+        <w:rPr>
+          <w:noProof/>
           <w:lang w:val="en-US"/>
         </w:rPr>
         <w:drawing>
-          <wp:anchor distT="0" distB="0" distL="114300" distR="114300" simplePos="0" relativeHeight="251661312" behindDoc="1" locked="0" layoutInCell="1" allowOverlap="1" wp14:anchorId="6C00E538">
+          <wp:anchor distT="0" distB="0" distL="114300" distR="114300" simplePos="0" relativeHeight="251661312" behindDoc="1" locked="0" layoutInCell="1" allowOverlap="1" wp14:anchorId="7EBA5176" wp14:editId="4CD4243C">
             <wp:simplePos x="0" y="0"/>
             <wp:positionH relativeFrom="margin">
               <wp:align>left</wp:align>
@@ -3813,90 +4243,11 @@
         </w:drawing>
       </w:r>
     </w:p>
-    <w:p>
-      <w:pPr>
-        <w:rPr>
-          <w:lang w:val="en-US"/>
-        </w:rPr>
-      </w:pPr>
-    </w:p>
-    <w:p>
-      <w:pPr>
-        <w:rPr>
-          <w:lang w:val="en-US"/>
-        </w:rPr>
-      </w:pPr>
-    </w:p>
-    <w:p>
-      <w:pPr>
-        <w:rPr>
-          <w:lang w:val="en-US"/>
-        </w:rPr>
-      </w:pPr>
-    </w:p>
-    <w:p>
-      <w:pPr>
-        <w:rPr>
-          <w:lang w:val="en-US"/>
-        </w:rPr>
-      </w:pPr>
-    </w:p>
-    <w:p>
-      <w:pPr>
-        <w:rPr>
-          <w:lang w:val="en-US"/>
-        </w:rPr>
-      </w:pPr>
-    </w:p>
-    <w:p>
-      <w:pPr>
-        <w:rPr>
-          <w:lang w:val="en-US"/>
-        </w:rPr>
-      </w:pPr>
-    </w:p>
-    <w:p>
-      <w:pPr>
-        <w:rPr>
-          <w:lang w:val="en-US"/>
-        </w:rPr>
-      </w:pPr>
-    </w:p>
-    <w:p>
-      <w:pPr>
-        <w:rPr>
-          <w:lang w:val="en-US"/>
-        </w:rPr>
-      </w:pPr>
-    </w:p>
-    <w:p>
-      <w:pPr>
-        <w:rPr>
-          <w:lang w:val="en-US"/>
-        </w:rPr>
-      </w:pPr>
-    </w:p>
-    <w:p>
-      <w:pPr>
-        <w:rPr>
-          <w:lang w:val="en-US"/>
-        </w:rPr>
-      </w:pPr>
-    </w:p>
-    <w:p>
-      <w:pPr>
-        <w:rPr>
-          <w:lang w:val="en-US"/>
-        </w:rPr>
-      </w:pPr>
-    </w:p>
-    <w:p>
-      <w:pPr>
-        <w:rPr>
-          <w:lang w:val="en-US"/>
-        </w:rPr>
-      </w:pPr>
-    </w:p>
+    <w:p/>
+    <w:p/>
+    <w:p/>
+    <w:p/>
+    <w:p/>
     <w:p>
       <w:pPr>
         <w:pStyle w:val="Prrafodelista"/>
@@ -3926,7 +4277,13 @@
         <w:rPr>
           <w:lang w:val="en-US"/>
         </w:rPr>
-        <w:t xml:space="preserve">PUT </w:t>
+        <w:t>GET</w:t>
+      </w:r>
+      <w:r>
+        <w:rPr>
+          <w:lang w:val="en-US"/>
+        </w:rPr>
+        <w:t xml:space="preserve"> </w:t>
       </w:r>
       <w:hyperlink r:id="rId31" w:history="1">
         <w:r>
@@ -3955,18 +4312,18 @@
           <w:lang w:val="en-US"/>
         </w:rPr>
         <w:drawing>
-          <wp:anchor distT="0" distB="0" distL="114300" distR="114300" simplePos="0" relativeHeight="251662336" behindDoc="1" locked="0" layoutInCell="1" allowOverlap="1" wp14:anchorId="75B0E41D">
+          <wp:anchor distT="0" distB="0" distL="114300" distR="114300" simplePos="0" relativeHeight="251662336" behindDoc="1" locked="0" layoutInCell="1" allowOverlap="1" wp14:anchorId="6D9B2BE9" wp14:editId="7FF6BF5D">
             <wp:simplePos x="0" y="0"/>
-            <wp:positionH relativeFrom="column">
+            <wp:positionH relativeFrom="margin">
               <wp:posOffset>300990</wp:posOffset>
             </wp:positionH>
             <wp:positionV relativeFrom="paragraph">
-              <wp:posOffset>38735</wp:posOffset>
+              <wp:posOffset>10160</wp:posOffset>
             </wp:positionV>
-            <wp:extent cx="4391025" cy="2697403"/>
-            <wp:effectExtent l="0" t="0" r="0" b="8255"/>
+            <wp:extent cx="4819650" cy="2996979"/>
+            <wp:effectExtent l="0" t="0" r="0" b="0"/>
             <wp:wrapNone/>
-            <wp:docPr id="15" name="Imagen 15"/>
+            <wp:docPr id="19" name="Imagen 19"/>
             <wp:cNvGraphicFramePr>
               <a:graphicFrameLocks xmlns:a="http://schemas.openxmlformats.org/drawingml/2006/main" noChangeAspect="1"/>
             </wp:cNvGraphicFramePr>
@@ -3992,7 +4349,7 @@
                   <pic:spPr>
                     <a:xfrm>
                       <a:off x="0" y="0"/>
-                      <a:ext cx="4391025" cy="2697403"/>
+                      <a:ext cx="4819650" cy="2996979"/>
                     </a:xfrm>
                     <a:prstGeom prst="rect">
                       <a:avLst/>
@@ -4055,6 +4412,41 @@
     </w:p>
     <w:p>
       <w:pPr>
+        <w:rPr>
+          <w:lang w:val="en-US"/>
+        </w:rPr>
+      </w:pPr>
+    </w:p>
+    <w:p>
+      <w:pPr>
+        <w:rPr>
+          <w:lang w:val="en-US"/>
+        </w:rPr>
+      </w:pPr>
+    </w:p>
+    <w:p>
+      <w:pPr>
+        <w:rPr>
+          <w:lang w:val="en-US"/>
+        </w:rPr>
+      </w:pPr>
+    </w:p>
+    <w:p>
+      <w:pPr>
+        <w:rPr>
+          <w:lang w:val="en-US"/>
+        </w:rPr>
+      </w:pPr>
+    </w:p>
+    <w:p>
+      <w:pPr>
+        <w:rPr>
+          <w:lang w:val="en-US"/>
+        </w:rPr>
+      </w:pPr>
+    </w:p>
+    <w:p>
+      <w:pPr>
         <w:pStyle w:val="Prrafodelista"/>
         <w:numPr>
           <w:ilvl w:val="0"/>
@@ -4070,7 +4462,6 @@
           <w:b/>
           <w:lang w:val="en-US"/>
         </w:rPr>
-        <w:lastRenderedPageBreak/>
         <w:t xml:space="preserve">EP39 – </w:t>
       </w:r>
       <w:proofErr w:type="spellStart"/>
@@ -4146,10 +4537,11 @@
       </w:pPr>
       <w:r>
         <w:rPr>
+          <w:noProof/>
           <w:lang w:val="en-US"/>
         </w:rPr>
         <w:drawing>
-          <wp:inline distT="0" distB="0" distL="0" distR="0" wp14:anchorId="730FA5FA" wp14:editId="4B45D8EC">
+          <wp:inline distT="0" distB="0" distL="0" distR="0" wp14:anchorId="6E93FE0D" wp14:editId="3E86361D">
             <wp:extent cx="5400040" cy="3355340"/>
             <wp:effectExtent l="0" t="0" r="0" b="0"/>
             <wp:docPr id="16" name="Imagen 16"/>
@@ -4195,6 +4587,14 @@
     </w:p>
     <w:p>
       <w:pPr>
+        <w:ind w:left="360"/>
+        <w:rPr>
+          <w:lang w:val="en-US"/>
+        </w:rPr>
+      </w:pPr>
+    </w:p>
+    <w:p>
+      <w:pPr>
         <w:pStyle w:val="Prrafodelista"/>
         <w:numPr>
           <w:ilvl w:val="0"/>
@@ -4210,6 +4610,7 @@
           <w:b/>
           <w:lang w:val="en-US"/>
         </w:rPr>
+        <w:lastRenderedPageBreak/>
         <w:t xml:space="preserve">EP40A – </w:t>
       </w:r>
       <w:proofErr w:type="spellStart"/>
@@ -4256,7 +4657,13 @@
         <w:rPr>
           <w:lang w:val="en-US"/>
         </w:rPr>
-        <w:t xml:space="preserve">POST </w:t>
+        <w:t xml:space="preserve">PUT </w:t>
+      </w:r>
+      <w:r>
+        <w:rPr>
+          <w:lang w:val="en-US"/>
+        </w:rPr>
+        <w:t xml:space="preserve"> </w:t>
       </w:r>
       <w:hyperlink r:id="rId35" w:history="1">
         <w:r>
@@ -4283,10 +4690,11 @@
       </w:pPr>
       <w:r>
         <w:rPr>
+          <w:noProof/>
           <w:lang w:val="en-US"/>
         </w:rPr>
         <w:drawing>
-          <wp:inline distT="0" distB="0" distL="0" distR="0" wp14:anchorId="4FD98230" wp14:editId="1B93B50F">
+          <wp:inline distT="0" distB="0" distL="0" distR="0" wp14:anchorId="3DD6CBBB" wp14:editId="74528C90">
             <wp:extent cx="5400040" cy="3355340"/>
             <wp:effectExtent l="0" t="0" r="0" b="0"/>
             <wp:docPr id="17" name="Imagen 17"/>
@@ -4350,13 +4758,11 @@
           <w:lang w:val="en-US"/>
         </w:rPr>
       </w:pPr>
-      <w:bookmarkStart w:id="0" w:name="_GoBack"/>
-      <w:r>
-        <w:rPr>
-          <w:b/>
-          <w:lang w:val="en-US"/>
-        </w:rPr>
-        <w:lastRenderedPageBreak/>
+      <w:r>
+        <w:rPr>
+          <w:b/>
+          <w:lang w:val="en-US"/>
+        </w:rPr>
         <w:t xml:space="preserve">EP40B – </w:t>
       </w:r>
       <w:proofErr w:type="spellStart"/>
@@ -4401,7 +4807,6 @@
       </w:r>
       <w:proofErr w:type="spellEnd"/>
     </w:p>
-    <w:bookmarkEnd w:id="0"/>
     <w:p>
       <w:pPr>
         <w:ind w:left="360"/>
@@ -4421,7 +4826,7 @@
             <w:rStyle w:val="Hipervnculo"/>
             <w:lang w:val="en-US"/>
           </w:rPr>
-          <w:t>http://localhost:8080/venta/anular?idVenta=6</w:t>
+          <w:t>http://localhost:8080/venta/anular?idVenta=5</w:t>
         </w:r>
       </w:hyperlink>
       <w:r>
@@ -4430,6 +4835,8 @@
         </w:rPr>
         <w:t xml:space="preserve"> </w:t>
       </w:r>
+      <w:bookmarkStart w:id="0" w:name="_GoBack"/>
+      <w:bookmarkEnd w:id="0"/>
     </w:p>
     <w:p>
       <w:pPr>
@@ -4443,10 +4850,10 @@
           <w:lang w:val="en-US"/>
         </w:rPr>
         <w:drawing>
-          <wp:inline distT="0" distB="0" distL="0" distR="0" wp14:anchorId="3C286851" wp14:editId="599F1024">
-            <wp:extent cx="5400040" cy="3254375"/>
-            <wp:effectExtent l="0" t="0" r="0" b="3175"/>
-            <wp:docPr id="18" name="Imagen 18"/>
+          <wp:inline distT="0" distB="0" distL="0" distR="0" wp14:anchorId="2048A3F6" wp14:editId="73D56145">
+            <wp:extent cx="5400040" cy="3382645"/>
+            <wp:effectExtent l="0" t="0" r="0" b="8255"/>
+            <wp:docPr id="21" name="Imagen 21"/>
             <wp:cNvGraphicFramePr>
               <a:graphicFrameLocks xmlns:a="http://schemas.openxmlformats.org/drawingml/2006/main" noChangeAspect="1"/>
             </wp:cNvGraphicFramePr>
@@ -4466,7 +4873,7 @@
                   <pic:spPr>
                     <a:xfrm>
                       <a:off x="0" y="0"/>
-                      <a:ext cx="5400040" cy="3254375"/>
+                      <a:ext cx="5400040" cy="3382645"/>
                     </a:xfrm>
                     <a:prstGeom prst="rect">
                       <a:avLst/>

</xml_diff>

<commit_message>
docs: se agregó la evidencia de pruebas de los endpoints EP27 a EP40
</commit_message>
<xml_diff>
--- a/docs/REQUEST_EP27-EP40.docx
+++ b/docs/REQUEST_EP27-EP40.docx
@@ -1262,7 +1262,13 @@
         <w:rPr>
           <w:lang w:val="en-US"/>
         </w:rPr>
-        <w:t xml:space="preserve">GET </w:t>
+        <w:t xml:space="preserve">PUT </w:t>
+      </w:r>
+      <w:r>
+        <w:rPr>
+          <w:lang w:val="en-US"/>
+        </w:rPr>
+        <w:t xml:space="preserve"> </w:t>
       </w:r>
       <w:hyperlink r:id="rId19" w:history="1">
         <w:r>
@@ -1640,16 +1646,19 @@
           <w:lang w:val="en-US"/>
         </w:rPr>
       </w:pPr>
-    </w:p>
-    <w:p>
-      <w:pPr>
-        <w:ind w:left="360"/>
-        <w:rPr>
-          <w:lang w:val="en-US"/>
-        </w:rPr>
-      </w:pPr>
-      <w:r>
-        <w:rPr>
+      <w:bookmarkStart w:id="0" w:name="_GoBack"/>
+      <w:bookmarkEnd w:id="0"/>
+    </w:p>
+    <w:p>
+      <w:pPr>
+        <w:ind w:left="360"/>
+        <w:rPr>
+          <w:lang w:val="en-US"/>
+        </w:rPr>
+      </w:pPr>
+      <w:r>
+        <w:rPr>
+          <w:noProof/>
           <w:lang w:val="en-US"/>
         </w:rPr>
         <w:lastRenderedPageBreak/>
@@ -4309,6 +4318,7 @@
       </w:pPr>
       <w:r>
         <w:rPr>
+          <w:noProof/>
           <w:lang w:val="en-US"/>
         </w:rPr>
         <w:drawing>
@@ -4835,18 +4845,17 @@
         </w:rPr>
         <w:t xml:space="preserve"> </w:t>
       </w:r>
-      <w:bookmarkStart w:id="0" w:name="_GoBack"/>
-      <w:bookmarkEnd w:id="0"/>
-    </w:p>
-    <w:p>
-      <w:pPr>
-        <w:ind w:left="360"/>
-        <w:rPr>
-          <w:lang w:val="en-US"/>
-        </w:rPr>
-      </w:pPr>
-      <w:r>
-        <w:rPr>
+    </w:p>
+    <w:p>
+      <w:pPr>
+        <w:ind w:left="360"/>
+        <w:rPr>
+          <w:lang w:val="en-US"/>
+        </w:rPr>
+      </w:pPr>
+      <w:r>
+        <w:rPr>
+          <w:noProof/>
           <w:lang w:val="en-US"/>
         </w:rPr>
         <w:drawing>

</xml_diff>